<commit_message>
Completar portada de la documentación con el segundo integrante
Co-Authored-By: Claude Opus 4.8 <noreply@anthropic.com>
</commit_message>
<xml_diff>
--- a/Documentacion_Tank-Attack.docx
+++ b/Documentacion_Tank-Attack.docx
@@ -145,7 +145,7 @@
           <w:sz w:val="24"/>
           <w:szCs w:val="24"/>
         </w:rPr>
-        <w:t xml:space="preserve">[Segundo integrante]</w:t>
+        <w:t xml:space="preserve">Said Reyes Quesada</w:t>
       </w:r>
     </w:p>
     <w:p>
@@ -14574,7 +14574,7 @@
       <w:r>
         <w:t xml:space="preserve">Pygame Documentation. </w:t>
       </w:r>
-      <w:hyperlink w:history="1" r:id="rIdfewbd5zjxvncfnfrswrzs">
+      <w:hyperlink w:history="1" r:id="rIdd4bbei8uxpyhzyew-c_xj">
         <w:r>
           <w:rPr>
             <w:rStyle w:val="Hyperlink"/>
@@ -14591,7 +14591,7 @@
       <w:r>
         <w:t xml:space="preserve">SWI-Prolog Reference Manual. </w:t>
       </w:r>
-      <w:hyperlink w:history="1" r:id="rId48avwnyffourtzvmwlq5w">
+      <w:hyperlink w:history="1" r:id="rIdx3qti3cwex7pf1awzg25l">
         <w:r>
           <w:rPr>
             <w:rStyle w:val="Hyperlink"/>
@@ -14608,7 +14608,7 @@
       <w:r>
         <w:t xml:space="preserve">PySwip — Python interface to SWI-Prolog. </w:t>
       </w:r>
-      <w:hyperlink w:history="1" r:id="rId07szam6z03jrzetmvfrfy">
+      <w:hyperlink w:history="1" r:id="rIdeyfzjg3ssvqecd-ewa-ek">
         <w:r>
           <w:rPr>
             <w:rStyle w:val="Hyperlink"/>

</xml_diff>